<commit_message>
🚀 despliegue tablero furag
</commit_message>
<xml_diff>
--- a/00_Evidencias_C.Cobro_SP/04_Abril/Soportes/OBLIGACION_01/Obli01_Actividades.docx
+++ b/00_Evidencias_C.Cobro_SP/04_Abril/Soportes/OBLIGACION_01/Obli01_Actividades.docx
@@ -39,19 +39,13 @@
       </w:pPr>
       <w:r>
         <w:rPr>
-          <w:noProof/>
+          <w:lang w:val="es-ES"/>
         </w:rPr>
         <w:drawing>
-          <wp:inline distT="0" distB="0" distL="0" distR="0" wp14:anchorId="239D42C3" wp14:editId="264ACF84">
-            <wp:extent cx="5713615" cy="4891883"/>
-            <wp:effectExtent l="0" t="0" r="1905" b="0"/>
-            <wp:docPr id="2" name="Picture 1">
-              <a:extLst xmlns:a="http://schemas.openxmlformats.org/drawingml/2006/main">
-                <a:ext uri="{FF2B5EF4-FFF2-40B4-BE49-F238E27FC236}">
-                  <a16:creationId xmlns:a16="http://schemas.microsoft.com/office/drawing/2014/main" id="{2321163F-0A44-71A0-4476-3576C99F3D4A}"/>
-                </a:ext>
-              </a:extLst>
-            </wp:docPr>
+          <wp:inline distT="0" distB="0" distL="0" distR="0" wp14:anchorId="7B35483F" wp14:editId="016DAE92">
+            <wp:extent cx="5943600" cy="3651250"/>
+            <wp:effectExtent l="0" t="0" r="0" b="6350"/>
+            <wp:docPr id="204875568" name="Picture 1"/>
             <wp:cNvGraphicFramePr>
               <a:graphicFrameLocks xmlns:a="http://schemas.openxmlformats.org/drawingml/2006/main" noChangeAspect="1"/>
             </wp:cNvGraphicFramePr>
@@ -59,16 +53,8 @@
               <a:graphicData uri="http://schemas.openxmlformats.org/drawingml/2006/picture">
                 <pic:pic xmlns:pic="http://schemas.openxmlformats.org/drawingml/2006/picture">
                   <pic:nvPicPr>
-                    <pic:cNvPr id="2" name="Picture 1">
-                      <a:extLst>
-                        <a:ext uri="{FF2B5EF4-FFF2-40B4-BE49-F238E27FC236}">
-                          <a16:creationId xmlns:a16="http://schemas.microsoft.com/office/drawing/2014/main" id="{2321163F-0A44-71A0-4476-3576C99F3D4A}"/>
-                        </a:ext>
-                      </a:extLst>
-                    </pic:cNvPr>
-                    <pic:cNvPicPr>
-                      <a:picLocks noChangeAspect="1"/>
-                    </pic:cNvPicPr>
+                    <pic:cNvPr id="204875568" name=""/>
+                    <pic:cNvPicPr/>
                   </pic:nvPicPr>
                   <pic:blipFill>
                     <a:blip r:embed="rId4"/>
@@ -79,7 +65,7 @@
                   <pic:spPr>
                     <a:xfrm>
                       <a:off x="0" y="0"/>
-                      <a:ext cx="5736505" cy="4911481"/>
+                      <a:ext cx="5943600" cy="3651250"/>
                     </a:xfrm>
                     <a:prstGeom prst="rect">
                       <a:avLst/>
@@ -101,9 +87,9 @@
       </w:pPr>
       <w:r>
         <w:rPr>
+          <w:noProof/>
           <w:lang w:val="es-ES"/>
         </w:rPr>
-        <w:lastRenderedPageBreak/>
         <w:drawing>
           <wp:inline distT="0" distB="0" distL="0" distR="0" wp14:anchorId="26230F6F" wp14:editId="2259A21E">
             <wp:extent cx="5943600" cy="2450465"/>

</xml_diff>